<commit_message>
feat(sales): make the ĐNCK document checklist (section 3) dynamic per order
A second sample (KOHINOOR HA20260069) confirmed the ĐNCK is still the same
BM08A L/C form; only the section-3 document list differs per order (46A).
Turn that list into a docxtemplater loop so it follows each order.

- template_DNCK_LC.docx: section 3 is now a {#docs}…{/docs} paragraph loop
  (one checkbox row per doc), preserving the Wingdings ☑ and line breaks
- discountRequestService: build the docs array from the negotiation's
  doc_checklist (46A), mapping each key to the Vietinbank English label and
  formatting the original/copy counts (Bill of Exchange keeps 2/2)

Co-Authored-By: Claude Opus 4.8 <noreply@anthropic.com>
</commit_message>
<xml_diff>
--- a/public/contract-templates/template_DNCK_LC.docx
+++ b/public/contract-templates/template_DNCK_LC.docx
@@ -716,6 +716,11 @@
       </w:pPr>
     </w:p>
     <w:p>
+      <w:r>
+        <w:t xml:space="preserve">{#docs}</w:t>
+      </w:r>
+    </w:p>
+    <w:p>
       <w:pPr>
         <w:pStyle w:val="TableParagraph"/>
         <w:spacing w:before="32"/>
@@ -742,7 +747,7 @@
           <w:u w:val="none"/>
           <w:lang w:val="en-US"/>
         </w:rPr>
-        <w:t xml:space="preserve"> Bill of Exchange</w:t>
+        <w:t xml:space="preserve"> {name}</w:t>
       </w:r>
     </w:p>
     <w:p>
@@ -766,25 +771,23 @@
           <w:u w:val="none"/>
           <w:lang w:val="en-US"/>
         </w:rPr>
-        <w:t xml:space="preserve">Original (s) </w:t>
-      </w:r>
-      <w:r>
-        <w:rPr>
-          <w:i/>
-          <w:sz w:val="24"/>
-          <w:u w:val="none"/>
-          <w:lang w:val="en-US"/>
-        </w:rPr>
-        <w:t>2/2</w:t>
-      </w:r>
-      <w:r>
-        <w:rPr>
-          <w:i/>
-          <w:sz w:val="24"/>
-          <w:u w:val="none"/>
-          <w:lang w:val="en-US"/>
-        </w:rPr>
-        <w:t xml:space="preserve"> </w:t>
+        <w:t>Original (s) {orig}</w:t>
+      </w:r>
+      <w:r>
+        <w:rPr>
+          <w:i/>
+          <w:sz w:val="24"/>
+          <w:u w:val="none"/>
+          <w:lang w:val="en-US"/>
+        </w:rPr>
+      </w:r>
+      <w:r>
+        <w:rPr>
+          <w:i/>
+          <w:sz w:val="24"/>
+          <w:u w:val="none"/>
+          <w:lang w:val="en-US"/>
+        </w:rPr>
       </w:r>
     </w:p>
     <w:p>
@@ -805,336 +808,20 @@
           <w:u w:val="none"/>
           <w:lang w:val="en-US"/>
         </w:rPr>
-        <w:t>Copy (ies) 00</w:t>
-      </w:r>
-      <w:r>
-        <w:rPr>
-          <w:i/>
-          <w:sz w:val="24"/>
-          <w:u w:val="none"/>
-          <w:lang w:val="en-US"/>
-        </w:rPr>
-        <w:tab/>
-      </w:r>
-    </w:p>
-    <w:p>
-      <w:pPr>
-        <w:pStyle w:val="TableParagraph"/>
-        <w:tabs>
-          <w:tab w:val="center" w:pos="3698"/>
-        </w:tabs>
-        <w:spacing w:before="32"/>
-        <w:rPr>
-          <w:i/>
-          <w:sz w:val="24"/>
-          <w:u w:val="none"/>
-          <w:lang w:val="en-US"/>
-        </w:rPr>
-      </w:pPr>
-      <w:r>
-        <w:rPr>
-          <w:i/>
-          <w:sz w:val="24"/>
-          <w:u w:val="none"/>
-          <w:lang w:val="en-US"/>
-        </w:rPr>
-        <w:sym w:font="Wingdings" w:char="F0FE"/>
-      </w:r>
-      <w:r>
-        <w:rPr>
-          <w:i/>
-          <w:sz w:val="24"/>
-          <w:u w:val="none"/>
-          <w:lang w:val="en-US"/>
-        </w:rPr>
-        <w:t xml:space="preserve"> Commercial Invoice</w:t>
-      </w:r>
-    </w:p>
-    <w:p>
-      <w:pPr>
-        <w:pStyle w:val="TableParagraph"/>
-        <w:tabs>
-          <w:tab w:val="center" w:pos="3698"/>
-        </w:tabs>
-        <w:spacing w:before="32"/>
-        <w:rPr>
-          <w:i/>
-          <w:sz w:val="24"/>
-          <w:u w:val="none"/>
-          <w:lang w:val="en-US"/>
-        </w:rPr>
-      </w:pPr>
-      <w:r>
-        <w:rPr>
-          <w:i/>
-          <w:sz w:val="24"/>
-          <w:u w:val="none"/>
-          <w:lang w:val="en-US"/>
-        </w:rPr>
-        <w:t>Original (s)  0</w:t>
-      </w:r>
-      <w:r>
-        <w:rPr>
-          <w:i/>
-          <w:sz w:val="24"/>
-          <w:u w:val="none"/>
-          <w:lang w:val="en-US"/>
-        </w:rPr>
-        <w:t>3</w:t>
-      </w:r>
-    </w:p>
-    <w:p>
-      <w:pPr>
-        <w:pStyle w:val="TableParagraph"/>
-        <w:tabs>
-          <w:tab w:val="center" w:pos="3698"/>
-        </w:tabs>
-        <w:spacing w:before="32"/>
-        <w:rPr>
-          <w:i/>
-          <w:sz w:val="24"/>
-          <w:u w:val="none"/>
-          <w:lang w:val="en-US"/>
-        </w:rPr>
-      </w:pPr>
-      <w:r>
-        <w:rPr>
-          <w:i/>
-          <w:sz w:val="24"/>
-          <w:u w:val="none"/>
-          <w:lang w:val="en-US"/>
-        </w:rPr>
-        <w:t>Copy (ies)    00</w:t>
-      </w:r>
-    </w:p>
-    <w:p>
-      <w:pPr>
-        <w:pStyle w:val="TableParagraph"/>
-        <w:tabs>
-          <w:tab w:val="center" w:pos="3698"/>
-        </w:tabs>
-        <w:spacing w:before="32"/>
-        <w:rPr>
-          <w:i/>
-          <w:sz w:val="24"/>
-          <w:u w:val="none"/>
-          <w:lang w:val="en-US"/>
-        </w:rPr>
-      </w:pPr>
-      <w:r>
-        <w:rPr>
-          <w:i/>
-          <w:sz w:val="24"/>
-          <w:u w:val="none"/>
-          <w:lang w:val="en-US"/>
-        </w:rPr>
-        <w:sym w:font="Wingdings" w:char="F0FE"/>
-      </w:r>
-      <w:r>
-        <w:rPr>
-          <w:i/>
-          <w:sz w:val="24"/>
-          <w:u w:val="none"/>
-          <w:lang w:val="en-US"/>
-        </w:rPr>
-        <w:t xml:space="preserve"> Packing List                          </w:t>
-      </w:r>
-    </w:p>
-    <w:p>
-      <w:pPr>
-        <w:pStyle w:val="TableParagraph"/>
-        <w:tabs>
-          <w:tab w:val="center" w:pos="3698"/>
-        </w:tabs>
-        <w:spacing w:before="32"/>
-        <w:rPr>
-          <w:i/>
-          <w:sz w:val="24"/>
-          <w:u w:val="none"/>
-          <w:lang w:val="pt-BR"/>
-        </w:rPr>
-      </w:pPr>
-      <w:r>
-        <w:rPr>
-          <w:i/>
-          <w:sz w:val="24"/>
-          <w:u w:val="none"/>
-          <w:lang w:val="pt-BR"/>
-        </w:rPr>
-        <w:t>Original (s)  0</w:t>
-      </w:r>
-      <w:r>
-        <w:rPr>
-          <w:i/>
-          <w:sz w:val="24"/>
-          <w:u w:val="none"/>
-          <w:lang w:val="pt-BR"/>
-        </w:rPr>
-        <w:t>3</w:t>
-      </w:r>
-      <w:r>
-        <w:rPr>
-          <w:i/>
-          <w:sz w:val="24"/>
-          <w:u w:val="none"/>
-          <w:lang w:val="pt-BR"/>
-        </w:rPr>
-        <w:t xml:space="preserve">                           </w:t>
-      </w:r>
-    </w:p>
-    <w:p>
-      <w:pPr>
-        <w:pStyle w:val="TableParagraph"/>
-        <w:spacing w:before="32"/>
-        <w:rPr>
-          <w:i/>
-          <w:sz w:val="24"/>
-          <w:u w:val="none"/>
-          <w:lang w:val="en-US"/>
-        </w:rPr>
-      </w:pPr>
-      <w:r>
-        <w:rPr>
-          <w:i/>
-          <w:sz w:val="24"/>
-          <w:u w:val="none"/>
-          <w:lang w:val="en-US"/>
-        </w:rPr>
-        <w:t>Copy (ies)   00</w:t>
-      </w:r>
-      <w:r>
-        <w:rPr>
-          <w:i/>
-          <w:sz w:val="24"/>
-          <w:u w:val="none"/>
-          <w:lang w:val="en-US"/>
-        </w:rPr>
-        <w:tab/>
-        <w:t xml:space="preserve">                </w:t>
-      </w:r>
-    </w:p>
-    <w:p>
-      <w:pPr>
-        <w:pStyle w:val="TableParagraph"/>
-        <w:tabs>
-          <w:tab w:val="center" w:pos="3698"/>
-        </w:tabs>
-        <w:spacing w:before="32"/>
-        <w:rPr>
-          <w:i/>
-          <w:sz w:val="24"/>
-          <w:u w:val="none"/>
-          <w:lang w:val="en-US"/>
-        </w:rPr>
-      </w:pPr>
-      <w:r>
-        <w:rPr>
-          <w:i/>
-          <w:sz w:val="24"/>
-          <w:u w:val="none"/>
-          <w:lang w:val="en-US"/>
-        </w:rPr>
-        <w:sym w:font="Wingdings" w:char="F0FE"/>
-      </w:r>
-      <w:r>
-        <w:rPr>
-          <w:i/>
-          <w:sz w:val="24"/>
-          <w:u w:val="none"/>
-          <w:lang w:val="en-US"/>
-        </w:rPr>
-        <w:t xml:space="preserve"> </w:t>
-      </w:r>
-      <w:r>
-        <w:rPr>
-          <w:i/>
-          <w:sz w:val="24"/>
-          <w:u w:val="none"/>
-          <w:lang w:val="en-US"/>
-        </w:rPr>
-        <w:t>Weight</w:t>
-      </w:r>
-      <w:r>
-        <w:rPr>
-          <w:i/>
-          <w:sz w:val="24"/>
-          <w:u w:val="none"/>
-          <w:lang w:val="en-US"/>
-        </w:rPr>
-        <w:t xml:space="preserve"> List                          </w:t>
-      </w:r>
-    </w:p>
-    <w:p>
-      <w:pPr>
-        <w:pStyle w:val="TableParagraph"/>
-        <w:tabs>
-          <w:tab w:val="center" w:pos="3698"/>
-        </w:tabs>
-        <w:spacing w:before="32"/>
-        <w:rPr>
-          <w:i/>
-          <w:sz w:val="24"/>
-          <w:u w:val="none"/>
-          <w:lang w:val="pt-BR"/>
-        </w:rPr>
-      </w:pPr>
-      <w:r>
-        <w:rPr>
-          <w:i/>
-          <w:sz w:val="24"/>
-          <w:u w:val="none"/>
-          <w:lang w:val="pt-BR"/>
-        </w:rPr>
-        <w:t>Original (s)  0</w:t>
-      </w:r>
-      <w:r>
-        <w:rPr>
-          <w:i/>
-          <w:sz w:val="24"/>
-          <w:u w:val="none"/>
-          <w:lang w:val="pt-BR"/>
-        </w:rPr>
-        <w:t>3</w:t>
-      </w:r>
-      <w:r>
-        <w:rPr>
-          <w:i/>
-          <w:sz w:val="24"/>
-          <w:u w:val="none"/>
-          <w:lang w:val="pt-BR"/>
-        </w:rPr>
-        <w:t xml:space="preserve">                           </w:t>
-      </w:r>
-    </w:p>
-    <w:p>
-      <w:pPr>
-        <w:pStyle w:val="TableParagraph"/>
-        <w:spacing w:before="32"/>
-        <w:rPr>
-          <w:i/>
-          <w:sz w:val="24"/>
-          <w:u w:val="none"/>
-          <w:lang w:val="en-US"/>
-        </w:rPr>
-      </w:pPr>
-      <w:r>
-        <w:rPr>
-          <w:i/>
-          <w:sz w:val="24"/>
-          <w:u w:val="none"/>
-          <w:lang w:val="en-US"/>
-        </w:rPr>
-        <w:t>Copy (ies)   00</w:t>
-      </w:r>
-      <w:r>
-        <w:rPr>
-          <w:i/>
-          <w:sz w:val="24"/>
-          <w:u w:val="none"/>
-          <w:lang w:val="en-US"/>
-        </w:rPr>
-        <w:tab/>
-        <w:t xml:space="preserve">                 </w:t>
+        <w:t>Copy (ies) {copy}</w:t>
+      </w:r>
+      <w:r>
+        <w:rPr>
+          <w:i/>
+          <w:sz w:val="24"/>
+          <w:u w:val="none"/>
+          <w:lang w:val="en-US"/>
+        </w:rPr>
+      </w:r>
+    </w:p>
+    <w:p>
+      <w:r>
+        <w:t xml:space="preserve">{/docs}</w:t>
       </w:r>
     </w:p>
     <w:p>

</xml_diff>